<commit_message>
Rebrand the integration spec doc to GetMatchReady with the indigo accent
Match the landing page: "GetMatchReady" throughout (was "MatchReady") and
the indigo accent rule instead of red.

Co-Authored-By: Claude Opus 4.8 <noreply@anthropic.com>
Claude-Session: https://claude.ai/code/session_018u9gfGCRwBF7xDumhssY86
</commit_message>
<xml_diff>
--- a/public/downloads/getmatchready-integration.docx
+++ b/public/downloads/getmatchready-integration.docx
@@ -14,13 +14,13 @@
           <w:sz w:val="40"/>
           <w:szCs w:val="40"/>
         </w:rPr>
-        <w:t xml:space="preserve">MatchReady</w:t>
+        <w:t xml:space="preserve">GetMatchReady</w:t>
       </w:r>
     </w:p>
     <w:p>
       <w:pPr>
         <w:pBdr>
-          <w:bottom w:val="single" w:color="CE2B37" w:sz="12" w:space="6"/>
+          <w:bottom w:val="single" w:color="6366F1" w:sz="12" w:space="6"/>
         </w:pBdr>
         <w:spacing w:after="60"/>
       </w:pPr>
@@ -83,7 +83,7 @@
           <w:sz w:val="21"/>
           <w:szCs w:val="21"/>
         </w:rPr>
-        <w:t xml:space="preserve">MatchReady is a hosted SCORM delivery layer that plays a module, resumes the referee exactly where they left off, streams video from a global CDN, and reports completion back to OMS. OMS integrates entirely over HTTPS. There is no JavaScript for OMS to build or maintain — MatchReady runs the player; OMS calls a URL and receives a webhook.</w:t>
+        <w:t xml:space="preserve">GetMatchReady is a hosted SCORM delivery layer that plays a module, resumes the referee exactly where they left off, streams video from a global CDN, and reports completion back to OMS. OMS integrates entirely over HTTPS. There is no JavaScript for OMS to build or maintain — GetMatchReady runs the player; OMS calls a URL and receives a webhook.</w:t>
       </w:r>
     </w:p>
     <w:p>
@@ -118,7 +118,7 @@
           <w:sz w:val="21"/>
           <w:szCs w:val="21"/>
         </w:rPr>
-        <w:t xml:space="preserve">OMS generates a short-lived, signed launch URL carrying the referee’s ID, name, module, state association, and a return URL. The referee opens it; MatchReady verifies the signature and starts the module — no separate account or password.</w:t>
+        <w:t xml:space="preserve">OMS generates a short-lived, signed launch URL carrying the referee’s ID, name, module, state association, and a return URL. The referee opens it; GetMatchReady verifies the signature and starts the module — no separate account or password.</w:t>
       </w:r>
     </w:p>
     <w:p>
@@ -139,7 +139,7 @@
           <w:sz w:val="21"/>
           <w:szCs w:val="21"/>
         </w:rPr>
-        <w:t xml:space="preserve">MatchReady serves the SCORM package (an OMS-authored package or the USSF package), streams the video from the CDN, and continuously saves the referee’s position (SCORM suspend data / lesson location) so they resume exactly where they stopped.</w:t>
+        <w:t xml:space="preserve">GetMatchReady serves the SCORM package (an OMS-authored package or the USSF package), streams the video from the CDN, and continuously saves the referee’s position (SCORM suspend data / lesson location) so they resume exactly where they stopped.</w:t>
       </w:r>
     </w:p>
     <w:p>
@@ -160,7 +160,7 @@
           <w:sz w:val="21"/>
           <w:szCs w:val="21"/>
         </w:rPr>
-        <w:t xml:space="preserve">The moment the referee completes, MatchReady sends a signed webhook to an OMS endpoint with the referee ID, module, status, score, timestamps, and certificate ID. OMS records it in RDS and reports to the state. A pull API is available for reconciliation.</w:t>
+        <w:t xml:space="preserve">The moment the referee completes, GetMatchReady sends a signed webhook to an OMS endpoint with the referee ID, module, status, score, timestamps, and certificate ID. OMS records it in RDS and reports to the state. A pull API is available for reconciliation.</w:t>
       </w:r>
     </w:p>
     <w:p>
@@ -174,7 +174,7 @@
           <w:bCs/>
           <w:color w:val="1A2A6B"/>
         </w:rPr>
-        <w:t xml:space="preserve">1 — Launch (OMS → MatchReady)</w:t>
+        <w:t xml:space="preserve">1 — Launch (OMS → GetMatchReady)</w:t>
       </w:r>
     </w:p>
     <w:p>
@@ -380,7 +380,7 @@
           <w:bCs/>
           <w:color w:val="1A2A6B"/>
         </w:rPr>
-        <w:t xml:space="preserve">2 — Completion callback (MatchReady → OMS)</w:t>
+        <w:t xml:space="preserve">2 — Completion callback (GetMatchReady → OMS)</w:t>
       </w:r>
     </w:p>
     <w:p>
@@ -392,7 +392,7 @@
           <w:sz w:val="21"/>
           <w:szCs w:val="21"/>
         </w:rPr>
-        <w:t xml:space="preserve">When the module reports complete, MatchReady POSTs a signed webhook to the OMS endpoint you provide:</w:t>
+        <w:t xml:space="preserve">When the module reports complete, GetMatchReady POSTs a signed webhook to the OMS endpoint you provide:</w:t>
       </w:r>
     </w:p>
     <w:p>
@@ -643,7 +643,7 @@
           <w:bCs/>
           <w:color w:val="1A2A6B"/>
         </w:rPr>
-        <w:t xml:space="preserve">3 — Reconciliation API (OMS → MatchReady, on demand)</w:t>
+        <w:t xml:space="preserve">3 — Reconciliation API (OMS → GetMatchReady, on demand)</w:t>
       </w:r>
     </w:p>
     <w:p>
@@ -841,7 +841,7 @@
           <w:sz w:val="21"/>
           <w:szCs w:val="21"/>
         </w:rPr>
-        <w:t xml:space="preserve">OMS uploads its own SCORM packages — e.g. Captivate-authored, with state-specific content — or MatchReady hosts the USSF packages.</w:t>
+        <w:t xml:space="preserve">OMS uploads its own SCORM packages — e.g. Captivate-authored, with state-specific content — or GetMatchReady hosts the USSF packages.</w:t>
       </w:r>
     </w:p>
     <w:p>
@@ -858,7 +858,7 @@
           <w:sz w:val="21"/>
           <w:szCs w:val="21"/>
         </w:rPr>
-        <w:t xml:space="preserve">Either way, MatchReady offloads the embedded video to the CDN so large modules load fast and cheaply, and the referee resumes at the exact slide.</w:t>
+        <w:t xml:space="preserve">Either way, GetMatchReady offloads the embedded video to the CDN so large modules load fast and cheaply, and the referee resumes at the exact slide.</w:t>
       </w:r>
     </w:p>
     <w:p>
@@ -939,7 +939,7 @@
                 <w:sz w:val="20"/>
                 <w:szCs w:val="20"/>
               </w:rPr>
-              <w:t xml:space="preserve">MatchReady owns</w:t>
+              <w:t xml:space="preserve">GetMatchReady owns</w:t>
             </w:r>
           </w:p>
         </w:tc>
@@ -1214,7 +1214,7 @@
           <w:sz w:val="21"/>
           <w:szCs w:val="21"/>
         </w:rPr>
-        <w:t xml:space="preserve">The player, resume/bookmarking, CDN video delivery, genuine completion tracking, certificates, and data export are live in production today. The launch-token and completion-webhook integration described here is the piece MatchReady stands up for OMS.</w:t>
+        <w:t xml:space="preserve">The player, resume/bookmarking, CDN video delivery, genuine completion tracking, certificates, and data export are live in production today. The launch-token and completion-webhook integration described here is the piece GetMatchReady stands up for OMS.</w:t>
       </w:r>
     </w:p>
     <w:p>
@@ -1230,7 +1230,7 @@
           <w:sz w:val="18"/>
           <w:szCs w:val="18"/>
         </w:rPr>
-        <w:t xml:space="preserve">Prepared by Jeremy Layton-Brown-Smith  ·  MatchReady</w:t>
+        <w:t xml:space="preserve">Prepared by Jeremy Layton-Brown-Smith  ·  GetMatchReady</w:t>
       </w:r>
     </w:p>
     <w:sectPr>

</xml_diff>

<commit_message>
Update the integration spec: cleaner prose, no em dashes, reconciliation API live
Rework the spec wording (tighter sentences, no em dashes, colon/"to" headings)
and reflect that the reconciliation pull API is now implemented and live.

Co-Authored-By: Claude Opus 4.8 <noreply@anthropic.com>
Claude-Session: https://claude.ai/code/session_018u9gfGCRwBF7xDumhssY86
</commit_message>
<xml_diff>
--- a/public/downloads/getmatchready-integration.docx
+++ b/public/downloads/getmatchready-integration.docx
@@ -45,7 +45,7 @@
           <w:sz w:val="21"/>
           <w:szCs w:val="21"/>
         </w:rPr>
-        <w:t xml:space="preserve">Delivering SCORM modules and returning completion data — with no JavaScript on the OMS side.</w:t>
+        <w:t xml:space="preserve">Delivers SCORM modules and reports completion data back to OMS, with no JavaScript on the OMS side.</w:t>
       </w:r>
     </w:p>
     <w:p>
@@ -71,7 +71,7 @@
           <w:sz w:val="21"/>
           <w:szCs w:val="21"/>
         </w:rPr>
-        <w:t xml:space="preserve">OMS owns the referee lifecycle — registration, identity, background checks, exams, requirement tracking, and reporting to the state associations — in its existing .NET / AWS / RDS stack, with integrations to US Soccer, Arbiter, and Assignor.</w:t>
+        <w:t xml:space="preserve">OMS owns the referee lifecycle: registration, identity, background checks, exams, requirement tracking, and reporting to the state associations, all running in its existing .NET / AWS / RDS stack, with integrations to US Soccer, Arbiter, and Assignor.</w:t>
       </w:r>
     </w:p>
     <w:p>
@@ -83,7 +83,7 @@
           <w:sz w:val="21"/>
           <w:szCs w:val="21"/>
         </w:rPr>
-        <w:t xml:space="preserve">GetMatchReady is a hosted SCORM delivery layer that plays a module, resumes the referee exactly where they left off, streams video from a global CDN, and reports completion back to OMS. OMS integrates entirely over HTTPS. There is no JavaScript for OMS to build or maintain — GetMatchReady runs the player; OMS calls a URL and receives a webhook.</w:t>
+        <w:t xml:space="preserve">GetMatchReady is a hosted SCORM delivery layer. It plays a module, resumes the referee exactly where they left off, streams video from a global CDN, and reports completion back to OMS. Integration happens entirely over HTTPS: OMS calls a URL, GetMatchReady runs the player, and a webhook comes back when the referee finishes. Nothing to build or maintain on OMS’s end.</w:t>
       </w:r>
     </w:p>
     <w:p>
@@ -97,7 +97,7 @@
           <w:bCs/>
           <w:color w:val="1A2A6B"/>
         </w:rPr>
-        <w:t xml:space="preserve">How it works — three touchpoints</w:t>
+        <w:t xml:space="preserve">How it works: three touchpoints</w:t>
       </w:r>
     </w:p>
     <w:p>
@@ -118,7 +118,7 @@
           <w:sz w:val="21"/>
           <w:szCs w:val="21"/>
         </w:rPr>
-        <w:t xml:space="preserve">OMS generates a short-lived, signed launch URL carrying the referee’s ID, name, module, state association, and a return URL. The referee opens it; GetMatchReady verifies the signature and starts the module — no separate account or password.</w:t>
+        <w:t xml:space="preserve">OMS generates a short-lived, signed launch URL carrying the referee’s ID, name, module, state association, and a return URL. The referee opens it, GetMatchReady verifies the signature, and the module starts. No separate account or password.</w:t>
       </w:r>
     </w:p>
     <w:p>
@@ -139,7 +139,7 @@
           <w:sz w:val="21"/>
           <w:szCs w:val="21"/>
         </w:rPr>
-        <w:t xml:space="preserve">GetMatchReady serves the SCORM package (an OMS-authored package or the USSF package), streams the video from the CDN, and continuously saves the referee’s position (SCORM suspend data / lesson location) so they resume exactly where they stopped.</w:t>
+        <w:t xml:space="preserve">GetMatchReady serves the SCORM package, either an OMS-authored one or the USSF package, and streams the video from the CDN. The referee’s position is saved continuously (SCORM suspend data / lesson location), so returning to a module picks up right where they left off.</w:t>
       </w:r>
     </w:p>
     <w:p>
@@ -160,7 +160,7 @@
           <w:sz w:val="21"/>
           <w:szCs w:val="21"/>
         </w:rPr>
-        <w:t xml:space="preserve">The moment the referee completes, GetMatchReady sends a signed webhook to an OMS endpoint with the referee ID, module, status, score, timestamps, and certificate ID. OMS records it in RDS and reports to the state. A pull API is available for reconciliation.</w:t>
+        <w:t xml:space="preserve">The moment the referee completes, GetMatchReady sends a signed webhook to an OMS endpoint with the referee ID, module, status, score, timestamps, and certificate ID. OMS records it in RDS and reports to the state. A pull API is also available for reconciliation.</w:t>
       </w:r>
     </w:p>
     <w:p>
@@ -174,7 +174,7 @@
           <w:bCs/>
           <w:color w:val="1A2A6B"/>
         </w:rPr>
-        <w:t xml:space="preserve">1 — Launch (OMS → GetMatchReady)</w:t>
+        <w:t xml:space="preserve">1. Launch (OMS to GetMatchReady)</w:t>
       </w:r>
     </w:p>
     <w:p>
@@ -380,7 +380,7 @@
           <w:bCs/>
           <w:color w:val="1A2A6B"/>
         </w:rPr>
-        <w:t xml:space="preserve">2 — Completion callback (GetMatchReady → OMS)</w:t>
+        <w:t xml:space="preserve">2. Completion callback (GetMatchReady to OMS)</w:t>
       </w:r>
     </w:p>
     <w:p>
@@ -629,7 +629,7 @@
           <w:sz w:val="21"/>
           <w:szCs w:val="21"/>
         </w:rPr>
-        <w:t xml:space="preserve">Delivery is retried automatically if OMS is briefly unavailable, so no completion is ever lost.</w:t>
+        <w:t xml:space="preserve">If OMS is briefly unavailable when this fires, delivery retries automatically.</w:t>
       </w:r>
     </w:p>
     <w:p>
@@ -643,7 +643,7 @@
           <w:bCs/>
           <w:color w:val="1A2A6B"/>
         </w:rPr>
-        <w:t xml:space="preserve">3 — Reconciliation API (OMS → GetMatchReady, on demand)</w:t>
+        <w:t xml:space="preserve">3. Reconciliation API (OMS to GetMatchReady, on demand)</w:t>
       </w:r>
     </w:p>
     <w:p>
@@ -776,7 +776,7 @@
           <w:sz w:val="21"/>
           <w:szCs w:val="21"/>
         </w:rPr>
-        <w:t xml:space="preserve">Launch tokens are signed with a shared secret and are short-lived and single-use — a link cannot be reused or forged.</w:t>
+        <w:t xml:space="preserve">Launch tokens are signed with a shared secret, short-lived, and single-use, so a link cannot be reused or forged.</w:t>
       </w:r>
     </w:p>
     <w:p>
@@ -810,7 +810,7 @@
           <w:sz w:val="21"/>
           <w:szCs w:val="21"/>
         </w:rPr>
-        <w:t xml:space="preserve">SCORM packages are served over HTTPS, same-origin, so completion tracking is tamper-resistant — a “complete” means the referee actually finished.</w:t>
+        <w:t xml:space="preserve">SCORM packages are served over HTTPS, same-origin, which makes completion tracking tamper-resistant: a “complete” reflects that the referee actually finished.</w:t>
       </w:r>
     </w:p>
     <w:p>
@@ -841,7 +841,7 @@
           <w:sz w:val="21"/>
           <w:szCs w:val="21"/>
         </w:rPr>
-        <w:t xml:space="preserve">OMS uploads its own SCORM packages — e.g. Captivate-authored, with state-specific content — or GetMatchReady hosts the USSF packages.</w:t>
+        <w:t xml:space="preserve">OMS can upload its own SCORM packages, Captivate-authored with state-specific content, or use the hosted USSF packages.</w:t>
       </w:r>
     </w:p>
     <w:p>
@@ -858,7 +858,7 @@
           <w:sz w:val="21"/>
           <w:szCs w:val="21"/>
         </w:rPr>
-        <w:t xml:space="preserve">Either way, GetMatchReady offloads the embedded video to the CDN so large modules load fast and cheaply, and the referee resumes at the exact slide.</w:t>
+        <w:t xml:space="preserve">Either way, embedded video is offloaded to the CDN, which keeps large modules loading quickly without adding cost on OMS’s side.</w:t>
       </w:r>
     </w:p>
     <w:p>
@@ -1214,7 +1214,7 @@
           <w:sz w:val="21"/>
           <w:szCs w:val="21"/>
         </w:rPr>
-        <w:t xml:space="preserve">The player, resume/bookmarking, CDN video delivery, genuine completion tracking, certificates, and data export are live in production today. The launch-token and completion-webhook integration described here is the piece GetMatchReady stands up for OMS.</w:t>
+        <w:t xml:space="preserve">The player, resume/bookmarking, CDN video delivery, completion tracking, certificates, data export, and the reconciliation API are live in production today. The launch-token and completion-webhook integration described here is what GetMatchReady stands up for OMS.</w:t>
       </w:r>
     </w:p>
     <w:p>

</xml_diff>